<commit_message>
Added 321 final project
</commit_message>
<xml_diff>
--- a/src/4_Individual_Assignment/401_Individual_Assignment_Kampwerth.docx
+++ b/src/4_Individual_Assignment/401_Individual_Assignment_Kampwerth.docx
@@ -84,13 +84,8 @@
         <w:spacing w:after="232"/>
         <w:jc w:val="center"/>
       </w:pPr>
-      <w:proofErr w:type="gramStart"/>
-      <w:r>
-        <w:t>by</w:t>
-      </w:r>
-      <w:proofErr w:type="gramEnd"/>
-      <w:r>
-        <w:t xml:space="preserve"> </w:t>
+      <w:r>
+        <w:t xml:space="preserve">by </w:t>
       </w:r>
     </w:p>
     <w:p>
@@ -429,47 +424,7 @@
         <w:ind w:left="2" w:right="188"/>
       </w:pPr>
       <w:r>
-        <w:t>AEOSSP by comparing Average Scheduling Profit, Average Scheduling Time, and Percentage of Excessive Profit across a range of task scales. The analysis shows that GDNN-PPO improves solution quality by roughly 50% relative to simple heuristics, achieves performance within about 7% of state-</w:t>
-      </w:r>
-      <w:proofErr w:type="spellStart"/>
-      <w:r>
-        <w:t>ofthe</w:t>
-      </w:r>
-      <w:proofErr w:type="spellEnd"/>
-      <w:r>
-        <w:t>-</w:t>
-      </w:r>
-      <w:proofErr w:type="gramStart"/>
-      <w:r>
-        <w:t>art metaheuristic</w:t>
-      </w:r>
-      <w:proofErr w:type="gramEnd"/>
-      <w:r>
-        <w:t xml:space="preserve"> methods, and reduces </w:t>
-      </w:r>
-      <w:proofErr w:type="gramStart"/>
-      <w:r>
-        <w:t>solve</w:t>
-      </w:r>
-      <w:proofErr w:type="gramEnd"/>
-      <w:r>
-        <w:t xml:space="preserve"> time by more than two orders of magnitude while maintaining near-linear scaling in the number of tasks. At the same time, the study identifies several modeling limitations, such as training on fixed problem sizes, simplified time-attitude graph construction, and incomplete use of </w:t>
-      </w:r>
-      <w:proofErr w:type="gramStart"/>
-      <w:r>
-        <w:t>critic</w:t>
-      </w:r>
-      <w:proofErr w:type="gramEnd"/>
-      <w:r>
-        <w:t xml:space="preserve"> information, that may restrict generalization and operational robustness. The report concludes that graph-based RL provides a viable and computationally efficient framework for </w:t>
-      </w:r>
-      <w:proofErr w:type="gramStart"/>
-      <w:r>
-        <w:t>AEOSSP, and</w:t>
-      </w:r>
-      <w:proofErr w:type="gramEnd"/>
-      <w:r>
-        <w:t xml:space="preserve"> recommends concrete architectural and training modifications to further improve scalability and reliability for future agile Earth observation missions. </w:t>
+        <w:t xml:space="preserve">AEOSSP by comparing Average Scheduling Profit, Average Scheduling Time, and Percentage of Excessive Profit across a range of task scales. The analysis shows that GDNN-PPO improves solution quality by roughly 50% relative to simple heuristics, achieves performance within about 7% of state-ofthe-art metaheuristic methods, and reduces solve time by more than two orders of magnitude while maintaining near-linear scaling in the number of tasks. At the same time, the study identifies several modeling limitations, such as training on fixed problem sizes, simplified time-attitude graph construction, and incomplete use of critic information, that may restrict generalization and operational robustness. The report concludes that graph-based RL provides a viable and computationally efficient framework for AEOSSP, and recommends concrete architectural and training modifications to further improve scalability and reliability for future agile Earth observation missions. </w:t>
       </w:r>
     </w:p>
     <w:p>
@@ -808,16 +763,32 @@
       <w:pPr>
         <w:ind w:left="738" w:right="188"/>
       </w:pPr>
-      <w:fldSimple w:instr=" TOC \h \z \c &quot;Figure&quot; ">
-        <w:r>
-          <w:rPr>
-            <w:b/>
-            <w:bCs/>
-            <w:noProof/>
-          </w:rPr>
-          <w:t>No table of figures entries found.</w:t>
-        </w:r>
-      </w:fldSimple>
+      <w:r>
+        <w:lastRenderedPageBreak/>
+        <w:fldChar w:fldCharType="begin"/>
+      </w:r>
+      <w:r>
+        <w:instrText xml:space="preserve"> TOC \h \z \c "Figure" </w:instrText>
+      </w:r>
+      <w:r>
+        <w:fldChar w:fldCharType="separate"/>
+      </w:r>
+      <w:r>
+        <w:rPr>
+          <w:b/>
+          <w:bCs/>
+          <w:noProof/>
+        </w:rPr>
+        <w:t>No table of figures entries found.</w:t>
+      </w:r>
+      <w:r>
+        <w:rPr>
+          <w:b/>
+          <w:bCs/>
+          <w:noProof/>
+        </w:rPr>
+        <w:fldChar w:fldCharType="end"/>
+      </w:r>
     </w:p>
     <w:p>
       <w:pPr>
@@ -887,24 +858,13 @@
         <w:ind w:left="738" w:right="188"/>
       </w:pPr>
       <w:r>
-        <w:t xml:space="preserve">Figure 4. Graph Decision Neural Network model architecture. (Chun, et al., </w:t>
-      </w:r>
-      <w:proofErr w:type="gramStart"/>
-      <w:r>
-        <w:t>2023)</w:t>
+        <w:t>Figure 4. Graph Decision Neural Network model architecture. (Chun, et al., 2023)</w:t>
       </w:r>
       <w:r>
         <w:rPr>
           <w:rFonts w:ascii="Calibri" w:eastAsia="Calibri" w:hAnsi="Calibri" w:cs="Calibri"/>
         </w:rPr>
-        <w:t>....................</w:t>
-      </w:r>
-      <w:proofErr w:type="gramEnd"/>
-      <w:r>
-        <w:rPr>
-          <w:rFonts w:ascii="Calibri" w:eastAsia="Calibri" w:hAnsi="Calibri" w:cs="Calibri"/>
-        </w:rPr>
-        <w:t xml:space="preserve"> 11</w:t>
+        <w:t>.................... 11</w:t>
       </w:r>
       <w:r>
         <w:rPr>
@@ -1049,15 +1009,7 @@
         <w:ind w:left="2" w:right="188"/>
       </w:pPr>
       <w:r>
-        <w:t>Boehnert, &amp; Wilhelmi, 2025), (Minnett, Alvera-Azcarate, &amp; Chin, 2019</w:t>
-      </w:r>
-      <w:proofErr w:type="gramStart"/>
-      <w:r>
-        <w:t>) ,</w:t>
-      </w:r>
-      <w:proofErr w:type="gramEnd"/>
-      <w:r>
-        <w:t xml:space="preserve"> (Raup, Andreassen, Bolch, &amp; </w:t>
+        <w:t xml:space="preserve">Boehnert, &amp; Wilhelmi, 2025), (Minnett, Alvera-Azcarate, &amp; Chin, 2019) , (Raup, Andreassen, Bolch, &amp; </w:t>
       </w:r>
     </w:p>
     <w:p>
@@ -1068,11 +1020,9 @@
       <w:r>
         <w:t xml:space="preserve">Bevan, 2015). More specifically, the development of Agile Earth Observation Satellites (AEOS) (Lemaitre &amp; Verfaillie, 2002), which now provide three degrees of freedom for tracking, enable the study of numerous, unrelated tasks across the </w:t>
       </w:r>
-      <w:proofErr w:type="gramStart"/>
-      <w:r>
-        <w:t>satellite’s entire observable view</w:t>
-      </w:r>
-      <w:proofErr w:type="gramEnd"/>
+      <w:r>
+        <w:t>entire observable view of the satellite</w:t>
+      </w:r>
       <w:r>
         <w:t xml:space="preserve">. Choosing an optimal ordering to perform each task within time and energy constraints is a combinatorial difficult NP-Hard problem </w:t>
       </w:r>
@@ -1083,15 +1033,7 @@
         <w:ind w:left="2" w:right="188"/>
       </w:pPr>
       <w:r>
-        <w:t xml:space="preserve">(Lemaitre &amp; Verfaillie, 2002), akin to the classical Traveling Salesman problem (Lawler, Lenstra, &amp; </w:t>
-      </w:r>
-      <w:proofErr w:type="spellStart"/>
-      <w:r>
-        <w:t>Rinnooy</w:t>
-      </w:r>
-      <w:proofErr w:type="spellEnd"/>
-      <w:r>
-        <w:t xml:space="preserve"> Kan, 1991), which can be seen in Figure 1.  </w:t>
+        <w:t xml:space="preserve">(Lemaitre &amp; Verfaillie, 2002), akin to the classical Traveling Salesman problem (Lawler, Lenstra, &amp; Rinnooy Kan, 1991), which can be seen in Figure 1.  </w:t>
       </w:r>
     </w:p>
     <w:p>
@@ -1165,19 +1107,21 @@
         <w:spacing w:after="0" w:line="470" w:lineRule="auto"/>
         <w:ind w:left="-8" w:right="188" w:firstLine="720"/>
       </w:pPr>
-      <w:proofErr w:type="gramStart"/>
-      <w:r>
-        <w:t>In order to</w:t>
-      </w:r>
-      <w:proofErr w:type="gramEnd"/>
-      <w:r>
-        <w:t xml:space="preserve"> construct a more optimal solver, AEOSSP can be reframed as a causally directed graph network with a time dimension and three spatial (rotation angle) dimensions. A graph network is a set of nodes (features of interest) connected via edges (relationships between features) which represent some arbitrarily abstract collection of information. A simple graph might be a friend group where the nodes represent people and the edge </w:t>
-      </w:r>
-      <w:proofErr w:type="gramStart"/>
+      <w:r>
+        <w:t>To</w:t>
+      </w:r>
+      <w:r>
+        <w:t xml:space="preserve"> construct a more optimal solver, AEOSSP can be reframed as a causally directed graph network with a time dimension and three spatial (rotation angle) dimensions. A graph network is a set of nodes (features of interest) connected via edges (relationships between features) which represent some arbitrarily abstract collection of information. A simple graph might be a friend group where the nodes represent people and the edge</w:t>
+      </w:r>
+      <w:r>
+        <w:t>s</w:t>
+      </w:r>
+      <w:r>
+        <w:t xml:space="preserve"> </w:t>
+      </w:r>
       <w:r>
         <w:t>represent</w:t>
       </w:r>
-      <w:proofErr w:type="gramEnd"/>
       <w:r>
         <w:t xml:space="preserve"> the relationship between any two pairs of people, i.e. Alice and Bob are friends while Bob and Charlie are enemies.  In AEOSSP, nodes represent observation tasks and edges represent time (and consequently energy) constraints between each task. Figure 2 showcases a two-dimensional version of AEOSSP  </w:t>
       </w:r>
@@ -1248,15 +1192,7 @@
         <w:ind w:left="-8" w:right="188" w:firstLine="720"/>
       </w:pPr>
       <w:r>
-        <w:t xml:space="preserve">For AEOSSP, it is valuable to understand how future rewards (completing tasks) can be achieved through choosing certain paths earlier as the most optimal total rewards may not be guaranteed if the maximal next reward is the only criteria (greedy algorithms). For example, a task with a </w:t>
-      </w:r>
-      <w:proofErr w:type="gramStart"/>
-      <w:r>
-        <w:t>large required</w:t>
-      </w:r>
-      <w:proofErr w:type="gramEnd"/>
-      <w:r>
-        <w:t xml:space="preserve"> observation time may provide a large reward, but it necessarily forces the satellite to miss many more </w:t>
+        <w:t xml:space="preserve">For AEOSSP, it is valuable to understand how future rewards (completing tasks) can be achieved through choosing certain paths earlier as the most optimal total rewards may not be guaranteed if the maximal next reward is the only criteria (greedy algorithms). For example, a task with a large required observation time may provide a large reward, but it necessarily forces the satellite to miss many more </w:t>
       </w:r>
       <w:r>
         <w:lastRenderedPageBreak/>
@@ -1269,15 +1205,7 @@
         <w:ind w:left="-8" w:right="188" w:firstLine="720"/>
       </w:pPr>
       <w:r>
-        <w:t xml:space="preserve">While choosing a graph-based model is sufficient for most problems formulated as graphs, AEOSSP presents the additional challenge of data distribution representability and reward modeling. The state space of AEOSSP is combinatorically large and therefore it may require a computationally intractable amount of </w:t>
-      </w:r>
-      <w:proofErr w:type="gramStart"/>
-      <w:r>
-        <w:t>compute</w:t>
-      </w:r>
-      <w:proofErr w:type="gramEnd"/>
-      <w:r>
-        <w:t xml:space="preserve"> to generate enough training examples for the model to generalize outside of its training set. Furthermore, rating each training example against the optimal solution would require an exact solution which is also computationally expensive. Given these two constraints, it is necessary to construct a model able to train itself through a Reinforcement Learning (RL) framework </w:t>
+        <w:t xml:space="preserve">While choosing a graph-based model is sufficient for most problems formulated as graphs, AEOSSP presents the additional challenge of data distribution representability and reward modeling. The state space of AEOSSP is combinatorically large and therefore it may require a computationally intractable amount of compute to generate enough training examples for the model to generalize outside of its training set. Furthermore, rating each training example against the optimal solution would require an exact solution which is also computationally expensive. Given these two constraints, it is necessary to construct a model able to train itself through a Reinforcement Learning (RL) framework </w:t>
       </w:r>
     </w:p>
     <w:p>
@@ -1384,19 +1312,15 @@
         <w:lastRenderedPageBreak/>
         <w:t xml:space="preserve">controlled by the critic. The critic then learns from the actor’s actions to update the value function to more accurately represent the state space’s rewards. In laymen’s terms, the critic computes the possible decisions and their </w:t>
       </w:r>
-      <w:proofErr w:type="gramStart"/>
-      <w:r>
-        <w:t>consequences</w:t>
-      </w:r>
-      <w:proofErr w:type="gramEnd"/>
+      <w:r>
+        <w:t>consequences,</w:t>
+      </w:r>
       <w:r>
         <w:t xml:space="preserve"> and the actor decides how to choose between the possible decisions for the best reward. Over many iterations, an RL agent near optimally generates its own training set by balancing exploration and exploitation as well as </w:t>
       </w:r>
-      <w:proofErr w:type="gramStart"/>
-      <w:r>
-        <w:t>assigns</w:t>
-      </w:r>
-      <w:proofErr w:type="gramEnd"/>
+      <w:r>
+        <w:t>assigning</w:t>
+      </w:r>
       <w:r>
         <w:t xml:space="preserve"> rewards to the training set based on its own perceived value, solving the additional constraints placed on a graph-based optimal solver. </w:t>
       </w:r>
@@ -1641,15 +1565,7 @@
         <w:ind w:left="738" w:right="188"/>
       </w:pPr>
       <w:r>
-        <w:t xml:space="preserve">To address these constraints, </w:t>
-      </w:r>
-      <w:proofErr w:type="gramStart"/>
-      <w:r>
-        <w:t>the literature</w:t>
-      </w:r>
-      <w:proofErr w:type="gramEnd"/>
-      <w:r>
-        <w:t xml:space="preserve"> proposes a Graph Decision Neural Network (GDNN) </w:t>
+        <w:t xml:space="preserve">To address these constraints, the literature proposes a Graph Decision Neural Network (GDNN) </w:t>
       </w:r>
     </w:p>
     <w:p>
@@ -1658,31 +1574,7 @@
         <w:ind w:left="2" w:right="188"/>
       </w:pPr>
       <w:r>
-        <w:t xml:space="preserve">RL agent architecture (Chun, et al., 2023). GDNNs are a minor modification to the classical Graph Neural Network (GNN) found throughout the machine learning field (Scarselli, Gori, &amp; Tsoi, 2009). A GNN’s basic principle is to share node information across connected edges to fully contextualize all the information in a graph, </w:t>
-      </w:r>
-      <w:proofErr w:type="gramStart"/>
-      <w:r>
-        <w:t>similar to</w:t>
-      </w:r>
-      <w:proofErr w:type="gramEnd"/>
-      <w:r>
-        <w:t xml:space="preserve"> how Convolutional Neural Networks (CNN) work but on an irregular grid (Bronstein, Bruna, &amp; </w:t>
-      </w:r>
-      <w:proofErr w:type="spellStart"/>
-      <w:r>
-        <w:t>LeCu</w:t>
-      </w:r>
-      <w:proofErr w:type="spellEnd"/>
-      <w:r>
-        <w:t xml:space="preserve">, 2017). Information is spread in “message passing” rounds where nodes aggregate information provided by their neighbors to add as a residual on the current stored information. Each round can be thought of as recontextualizing the information stored at each node based on the nodes connected to it. Information can therefore propagate through a graph over several rounds of message passing to result in a final contextualized state of the graph. In AEOSSP, this framework allows future tasks to inform prior tasks about their characteristics which theoretically enables the current task to understand the </w:t>
-      </w:r>
-      <w:proofErr w:type="gramStart"/>
-      <w:r>
-        <w:t>context</w:t>
-      </w:r>
-      <w:proofErr w:type="gramEnd"/>
-      <w:r>
-        <w:t xml:space="preserve"> several tasks in the future given only the next available tasks. Given the contextualized model, the GNN is modified to contain a final output layer to decide between the potential next available tasks (a GDNN) which is then used to update the graph to the next state.  </w:t>
+        <w:t xml:space="preserve">RL agent architecture (Chun, et al., 2023). GDNNs are a minor modification to the classical Graph Neural Network (GNN) found throughout the machine learning field (Scarselli, Gori, &amp; Tsoi, 2009). A GNN’s basic principle is to share node information across connected edges to fully contextualize all the information in a graph, similar to how Convolutional Neural Networks (CNN) work but on an irregular grid (Bronstein, Bruna, &amp; LeCu, 2017). Information is spread in “message passing” rounds where nodes aggregate information provided by their neighbors to add as a residual on the current stored information. Each round can be thought of as recontextualizing the information stored at each node based on the nodes connected to it. Information can therefore propagate through a graph over several rounds of message passing to result in a final contextualized state of the graph. In AEOSSP, this framework allows future tasks to inform prior tasks about their characteristics which theoretically enables the current task to understand the context several tasks in the future given only the next available tasks. Given the contextualized model, the GNN is modified to contain a final output layer to decide between the potential next available tasks (a GDNN) which is then used to update the graph to the next state.  </w:t>
       </w:r>
     </w:p>
     <w:p>
@@ -1752,15 +1644,7 @@
         <w:ind w:left="-8" w:right="188" w:firstLine="720"/>
       </w:pPr>
       <w:r>
-        <w:t xml:space="preserve">The use of a graph-based method can identify the best path (subgraph) with accuracy comparable to CNNs (the most successful ML model formulated) (Bronstein, Bruna, &amp; </w:t>
-      </w:r>
-      <w:proofErr w:type="spellStart"/>
-      <w:r>
-        <w:t>LeCu</w:t>
-      </w:r>
-      <w:proofErr w:type="spellEnd"/>
-      <w:r>
-        <w:t xml:space="preserve">, 2017) as well as scale with tasks more efficiently, </w:t>
+        <w:t xml:space="preserve">The use of a graph-based method can identify the best path (subgraph) with accuracy comparable to CNNs (the most successful ML model formulated) (Bronstein, Bruna, &amp; LeCu, 2017) as well as scale with tasks more efficiently, </w:t>
       </w:r>
       <w:r>
         <w:rPr>
@@ -1811,33 +1695,15 @@
       <w:r>
         <w:t xml:space="preserve">As a high-level overview, the actor GDNN encodes the list of tasks into a graph representation which is passed through the model to </w:t>
       </w:r>
-      <w:proofErr w:type="gramStart"/>
-      <w:r>
-        <w:t>make a decision</w:t>
-      </w:r>
-      <w:proofErr w:type="gramEnd"/>
-      <w:r>
-        <w:t xml:space="preserve"> on the next task. The satellite then moves to </w:t>
+      <w:r>
+        <w:t>decide</w:t>
+      </w:r>
+      <w:r>
+        <w:t xml:space="preserve"> on the next task. The satellite then moves to perform that task </w:t>
       </w:r>
       <w:r>
         <w:lastRenderedPageBreak/>
-        <w:t xml:space="preserve">perform that task (under the time and energy constraints encoded in the nodal information) which represents the updated graph state. This then repeats until the satellite reaches the final target time where the total rewards are accumulated based on the value assigned </w:t>
-      </w:r>
-      <w:proofErr w:type="gramStart"/>
-      <w:r>
-        <w:t>from</w:t>
-      </w:r>
-      <w:proofErr w:type="gramEnd"/>
-      <w:r>
-        <w:t xml:space="preserve"> the critic GDNN. The rewards are then used to update the actor and then </w:t>
-      </w:r>
-      <w:proofErr w:type="gramStart"/>
-      <w:r>
-        <w:t>critic</w:t>
-      </w:r>
-      <w:proofErr w:type="gramEnd"/>
-      <w:r>
-        <w:t xml:space="preserve"> weights to reflect the information learned through the training set and the cycle is repeated until the framework reaches the convergence criteria. The Average Scheduling Profit (ASP), the Average Scheduling Time (AST), and Percentage of Excessive Profit (PSP) are compared against other methods to determine the most optimal method. </w:t>
+        <w:t xml:space="preserve">(under the time and energy constraints encoded in the nodal information) which represents the updated graph state. This then repeats until the satellite reaches the final target time where the total rewards are accumulated based on the value assigned from the critic GDNN. The rewards are then used to update the actor and then critic weights to reflect the information learned through the training set and the cycle is repeated until the framework reaches the convergence criteria. The Average Scheduling Profit (ASP), the Average Scheduling Time (AST), and Percentage of Excessive Profit (PSP) are compared against other methods to determine the most optimal method. </w:t>
       </w:r>
     </w:p>
     <w:p>
@@ -1931,29 +1797,8 @@
         <w:spacing w:after="8" w:line="468" w:lineRule="auto"/>
         <w:ind w:left="-8" w:right="188" w:firstLine="720"/>
       </w:pPr>
-      <w:proofErr w:type="gramStart"/>
-      <w:r>
-        <w:t>The literature</w:t>
-      </w:r>
-      <w:proofErr w:type="gramEnd"/>
-      <w:r>
-        <w:t xml:space="preserve"> designs four heuristics as well as a GDNN with a Deep Quality Network (DQN) which represents a more standard RL framework approach compared to PPO (</w:t>
-      </w:r>
-      <w:proofErr w:type="spellStart"/>
-      <w:r>
-        <w:t>Mnih</w:t>
-      </w:r>
-      <w:proofErr w:type="spellEnd"/>
-      <w:r>
-        <w:t xml:space="preserve"> &amp; </w:t>
-      </w:r>
-      <w:proofErr w:type="spellStart"/>
-      <w:r>
-        <w:t>Kavukcuoglu</w:t>
-      </w:r>
-      <w:proofErr w:type="spellEnd"/>
-      <w:r>
-        <w:t xml:space="preserve">, </w:t>
+      <w:r>
+        <w:t xml:space="preserve">The literature designs four heuristics as well as a GDNN with a Deep Quality Network (DQN) which represents a more standard RL framework approach compared to PPO (Mnih &amp; Kavukcuoglu, </w:t>
       </w:r>
     </w:p>
     <w:p>
@@ -2043,15 +1888,7 @@
       </w:pPr>
       <w:r>
         <w:lastRenderedPageBreak/>
-        <w:t xml:space="preserve">STWA is perhaps the most natural implementation possible. Tasks are ordered based on </w:t>
-      </w:r>
-      <w:proofErr w:type="gramStart"/>
-      <w:r>
-        <w:t>their</w:t>
-      </w:r>
-      <w:proofErr w:type="gramEnd"/>
-      <w:r>
-        <w:t xml:space="preserve"> </w:t>
+        <w:t xml:space="preserve">STWA is perhaps the most natural implementation possible. Tasks are ordered based on their </w:t>
       </w:r>
     </w:p>
     <w:p>
@@ -2060,23 +1897,7 @@
         <w:ind w:left="2" w:right="188"/>
       </w:pPr>
       <w:r>
-        <w:t xml:space="preserve">start time and the completed based on their availability and constraints as soon as they are available, maximizing the number of tasks completed. STWA ignores all other </w:t>
-      </w:r>
-      <w:proofErr w:type="gramStart"/>
-      <w:r>
-        <w:t>aspect</w:t>
-      </w:r>
-      <w:proofErr w:type="gramEnd"/>
-      <w:r>
-        <w:t xml:space="preserve"> </w:t>
-      </w:r>
-      <w:proofErr w:type="gramStart"/>
-      <w:r>
-        <w:t>about</w:t>
-      </w:r>
-      <w:proofErr w:type="gramEnd"/>
-      <w:r>
-        <w:t xml:space="preserve"> each task such as reward, duration, or energy requirements which results in poor performance when tasks are of mixed rewards, mixed duration, or physically separated. </w:t>
+        <w:t xml:space="preserve">start time and the completed based on their availability and constraints as soon as they are available, maximizing the number of tasks completed. STWA ignores all other aspect about each task such as reward, duration, or energy requirements which results in poor performance when tasks are of mixed rewards, mixed duration, or physically separated. </w:t>
       </w:r>
     </w:p>
     <w:p>
@@ -2192,15 +2013,7 @@
         <w:jc w:val="right"/>
       </w:pPr>
       <w:r>
-        <w:t xml:space="preserve">Despite the poor performance, </w:t>
-      </w:r>
-      <w:proofErr w:type="gramStart"/>
-      <w:r>
-        <w:t>the heuristics</w:t>
-      </w:r>
-      <w:proofErr w:type="gramEnd"/>
-      <w:r>
-        <w:t xml:space="preserve"> provide valuable information about AEOSSP. More </w:t>
+        <w:t xml:space="preserve">Despite the poor performance, the heuristics provide valuable information about AEOSSP. </w:t>
       </w:r>
     </w:p>
     <w:p>
@@ -2208,11 +2021,9 @@
         <w:spacing w:after="0" w:line="470" w:lineRule="auto"/>
         <w:ind w:left="2" w:right="188"/>
       </w:pPr>
-      <w:proofErr w:type="gramStart"/>
-      <w:r>
-        <w:t>specifically</w:t>
-      </w:r>
-      <w:proofErr w:type="gramEnd"/>
+      <w:r>
+        <w:t>Specifically</w:t>
+      </w:r>
       <w:r>
         <w:t xml:space="preserve">, the heuristics perform similarly (within tens of relative percent of each other) while optimizing for significantly different criteria. Therefore, it can be concluded that task availability, reward value, task duration, and spatial and temporal separation all remain important to AEOSSP and, consequently, all valid solvers must respect each of these aspects.  </w:t>
       </w:r>
@@ -2243,15 +2054,7 @@
         <w:jc w:val="both"/>
       </w:pPr>
       <w:r>
-        <w:t xml:space="preserve">The literature then expands to compare against more accurate methods in Figure 7: GRILS, </w:t>
-      </w:r>
-      <w:proofErr w:type="spellStart"/>
-      <w:r>
-        <w:t>Selfadaption</w:t>
-      </w:r>
-      <w:proofErr w:type="spellEnd"/>
-      <w:r>
-        <w:t xml:space="preserve"> Differential Evolution (SDE), and Self-adaptation Genetic Algorithm (SGA) (Peng, Song, He, &amp; Yu, 2020), (Li, Chen, &amp; Yao, 2017). </w:t>
+        <w:t xml:space="preserve">The literature then expands to compare against more accurate methods in Figure 7: GRILS, Selfadaption Differential Evolution (SDE), and Self-adaptation Genetic Algorithm (SGA) (Peng, Song, He, &amp; Yu, 2020), (Li, Chen, &amp; Yao, 2017). </w:t>
       </w:r>
     </w:p>
     <w:p>
@@ -2410,23 +2213,7 @@
         <w:ind w:left="-8" w:right="188" w:firstLine="720"/>
       </w:pPr>
       <w:r>
-        <w:t xml:space="preserve">Based </w:t>
-      </w:r>
-      <w:proofErr w:type="gramStart"/>
-      <w:r>
-        <w:t>off</w:t>
-      </w:r>
-      <w:proofErr w:type="gramEnd"/>
-      <w:r>
-        <w:t xml:space="preserve"> the literature provided, there are </w:t>
-      </w:r>
-      <w:proofErr w:type="gramStart"/>
-      <w:r>
-        <w:t>a number of</w:t>
-      </w:r>
-      <w:proofErr w:type="gramEnd"/>
-      <w:r>
-        <w:t xml:space="preserve"> potential improvements to the modeling methods which may improve the performance of such a model.  </w:t>
+        <w:t xml:space="preserve">Based off the literature provided, there are a number of potential improvements to the modeling methods which may improve the performance of such a model.  </w:t>
       </w:r>
     </w:p>
     <w:p>
@@ -2445,17 +2232,7 @@
         <w:ind w:left="2" w:right="188"/>
       </w:pPr>
       <w:r>
-        <w:t xml:space="preserve">trained on. This necessarily restricts the model to learning how to optimize over a set horizon rather than learning a generalized solution over an indefinite horizon, a distinction which the literature acknowledges through comparison of the GDNN-PPO model trained and tested at varying scales. Given the model’s ability to train and test on differing task scales, a natural improvement to the model would be the inclusion of a variety of task scales in the model’s environment. It follows that a scale-invariant GDNNPPO would necessarily improve the generalizability to a wide variety of task scales as expected in </w:t>
-      </w:r>
-      <w:proofErr w:type="spellStart"/>
-      <w:proofErr w:type="gramStart"/>
-      <w:r>
-        <w:t>realworld</w:t>
-      </w:r>
-      <w:proofErr w:type="spellEnd"/>
-      <w:proofErr w:type="gramEnd"/>
-      <w:r>
-        <w:t xml:space="preserve"> deployment. Combining a variety of task scales could also be done gradually throughout the training procedure with the introduction of larger task scales only after the model has begun understanding smaller cases. This method could additionally promote stability in training which random shuffling of task sizes may erode. </w:t>
+        <w:t xml:space="preserve">trained on. This necessarily restricts the model to learning how to optimize over a set horizon rather than learning a generalized solution over an indefinite horizon, a distinction which the literature acknowledges through comparison of the GDNN-PPO model trained and tested at varying scales. Given the model’s ability to train and test on differing task scales, a natural improvement to the model would be the inclusion of a variety of task scales in the model’s environment. It follows that a scale-invariant GDNNPPO would necessarily improve the generalizability to a wide variety of task scales as expected in realworld deployment. Combining a variety of task scales could also be done gradually throughout the training procedure with the introduction of larger task scales only after the model has begun understanding smaller cases. This method could additionally promote stability in training which random shuffling of task sizes may erode. </w:t>
       </w:r>
     </w:p>
     <w:p>
@@ -2465,17 +2242,13 @@
       </w:pPr>
       <w:r>
         <w:lastRenderedPageBreak/>
-        <w:t>The graph modeling of AEOSSP in the literature is done via a time-attitude adjacency graph where distances are computed via a time heuristic equation that only incorporates the roll angle while ignoring pitch and yaw angles. Furthermore, the edge connections are generated via a five-</w:t>
-      </w:r>
-      <w:proofErr w:type="spellStart"/>
-      <w:proofErr w:type="gramStart"/>
-      <w:r>
-        <w:t>nearestneighbors</w:t>
-      </w:r>
-      <w:proofErr w:type="spellEnd"/>
-      <w:proofErr w:type="gramEnd"/>
-      <w:r>
-        <w:t xml:space="preserve"> computation performed in the time heuristic domain. While theoretically sufficient, the graph modeling approach is both simple and restrictive to the information naturally stored within each task. Incorporating all three angles via the transition angle equation already defined in the literature likely improves the model’s understanding of the true mechanics without sacrificing any time constraints which are validated later in the process. Furthermore, adding additional nodal information related to the constraints, such as slack time to the View Time Window (VTW) end when transitioning nodes, may aid the model’s ability to select subgraphs which prevent dead ends.  </w:t>
+        <w:t>The graph modeling of AEOSSP in the literature is done via a time-attitude adjacency graph where distances are computed via a time heuristic equation that only incorporates the roll angle while ignoring pitch and yaw angles. Furthermore, the edge connections are generated via a five-nearest</w:t>
+      </w:r>
+      <w:r>
+        <w:t xml:space="preserve"> </w:t>
+      </w:r>
+      <w:r>
+        <w:t xml:space="preserve">neighbors computation performed in the time heuristic domain. While theoretically sufficient, the graph modeling approach is both simple and restrictive to the information naturally stored within each task. Incorporating all three angles via the transition angle equation already defined in the literature likely improves the model’s understanding of the true mechanics without sacrificing any time constraints which are validated later in the process. Furthermore, adding additional nodal information related to the constraints, such as slack time to the View Time Window (VTW) end when transitioning nodes, may aid the model’s ability to select subgraphs which prevent dead ends.  </w:t>
       </w:r>
     </w:p>
     <w:p>
@@ -2486,27 +2259,21 @@
       <w:r>
         <w:t xml:space="preserve">The RL framework in the literature lacks a proper description of the critic network, a crucial aspect of the RL architecture, and thus is assumed to </w:t>
       </w:r>
-      <w:proofErr w:type="gramStart"/>
-      <w:r>
-        <w:t>an</w:t>
-      </w:r>
-      <w:proofErr w:type="gramEnd"/>
+      <w:r>
+        <w:t>be an</w:t>
+      </w:r>
       <w:r>
         <w:t xml:space="preserve"> identical model structure to the actor network (GDNN). The actor and critic model are assumed to have independent encoding structures (embedding layers) which typically </w:t>
       </w:r>
-      <w:proofErr w:type="gramStart"/>
-      <w:r>
-        <w:t>hurts</w:t>
-      </w:r>
-      <w:proofErr w:type="gramEnd"/>
+      <w:r>
+        <w:t>hurt</w:t>
+      </w:r>
       <w:r>
         <w:t xml:space="preserve"> alignment between the actor and critic, harming generalization. Utilizing a shared encoding structure between actor and critic with separate GNN layer blocks both unifies the learned representation of the agent as well as maintains the representability of the individual networks. Furthermore, adding regularization to the critic, such as </w:t>
       </w:r>
-      <w:proofErr w:type="gramStart"/>
-      <w:r>
-        <w:t>a L2</w:t>
-      </w:r>
-      <w:proofErr w:type="gramEnd"/>
+      <w:r>
+        <w:t>L2</w:t>
+      </w:r>
       <w:r>
         <w:t xml:space="preserve"> loss or physics-informed losses, may provide increased stability or accuracy over training while maintaining or improving the generalizability of the model. Additionally, removing infeasible transitions between tasks creates sharp gradients during training which are not immediately visible compared to when infeasible transitions are utilized directly in the reward structure. Adding constraint-based losses with smooth gradients (PPO-Lagrangian) may improve training and generalizability to optimal strategies rather than pattern exploitation. </w:t>
       </w:r>
@@ -2541,15 +2308,7 @@
         <w:ind w:left="-8" w:right="188" w:firstLine="720"/>
       </w:pPr>
       <w:r>
-        <w:t xml:space="preserve">GDNN-PPO achieved an approximately 50% increase in model performance on average compared to basic heuristics and fell within 7% of the SOTA heuristics-based methods while maintaining near linear scaling on task size and remaining with a 2 </w:t>
-      </w:r>
-      <w:proofErr w:type="gramStart"/>
-      <w:r>
-        <w:t>second solve</w:t>
-      </w:r>
-      <w:proofErr w:type="gramEnd"/>
-      <w:r>
-        <w:t xml:space="preserve"> time. The 350x reduction in solve time compared to the SOTA methods represents a fundamental shift in the usage away from pure research to practical implementation. Furthermore, the success of the model proposed suggests similar classes of NP-Hard problems can approximately solved in real-time, a potentially revolutionary possibility. </w:t>
+        <w:t xml:space="preserve">GDNN-PPO achieved an approximately 50% increase in model performance on average compared to basic heuristics and fell within 7% of the SOTA heuristics-based methods while maintaining near linear scaling on task size and remaining with a 2 second solve time. The 350x reduction in solve time compared to the SOTA methods represents a fundamental shift in the usage away from pure research to practical implementation. Furthermore, the success of the model proposed suggests similar classes of NP-Hard problems can approximately solved in real-time, a potentially revolutionary possibility. </w:t>
       </w:r>
     </w:p>
     <w:p>
@@ -2601,15 +2360,7 @@
         <w:ind w:left="2" w:right="188"/>
       </w:pPr>
       <w:r>
-        <w:t xml:space="preserve">Bronstein, M., Bruna, J., &amp; </w:t>
-      </w:r>
-      <w:proofErr w:type="spellStart"/>
-      <w:r>
-        <w:t>LeCu</w:t>
-      </w:r>
-      <w:proofErr w:type="spellEnd"/>
-      <w:r>
-        <w:t xml:space="preserve">, Y. (2017). Geometric Deep Learning: Going beyond Euclidean data. </w:t>
+        <w:t xml:space="preserve">Bronstein, M., Bruna, J., &amp; LeCu, Y. (2017). Geometric Deep Learning: Going beyond Euclidean data. </w:t>
       </w:r>
     </w:p>
     <w:p>
@@ -2663,15 +2414,7 @@
         <w:ind w:left="2" w:right="188"/>
       </w:pPr>
       <w:r>
-        <w:t xml:space="preserve">Lawler, E., Lenstra, J., &amp; </w:t>
-      </w:r>
-      <w:proofErr w:type="spellStart"/>
-      <w:r>
-        <w:t>Rinnooy</w:t>
-      </w:r>
-      <w:proofErr w:type="spellEnd"/>
-      <w:r>
-        <w:t xml:space="preserve"> Kan, A. (1991). </w:t>
+        <w:t xml:space="preserve">Lawler, E., Lenstra, J., &amp; Rinnooy Kan, A. (1991). </w:t>
       </w:r>
       <w:r>
         <w:rPr>
@@ -2724,15 +2467,7 @@
         <w:ind w:left="2" w:right="188"/>
       </w:pPr>
       <w:r>
-        <w:t xml:space="preserve">Li, G., Chen, C., &amp; Yao, F. (2017). Hybrid Differential Evolution </w:t>
-      </w:r>
-      <w:proofErr w:type="spellStart"/>
-      <w:r>
-        <w:t>Optimisation</w:t>
-      </w:r>
-      <w:proofErr w:type="spellEnd"/>
-      <w:r>
-        <w:t xml:space="preserve"> for Earth Observation </w:t>
+        <w:t xml:space="preserve">Li, G., Chen, C., &amp; Yao, F. (2017). Hybrid Differential Evolution Optimisation for Earth Observation </w:t>
       </w:r>
     </w:p>
     <w:p>
@@ -2758,15 +2493,7 @@
         <w:ind w:left="712" w:right="188" w:hanging="720"/>
       </w:pPr>
       <w:r>
-        <w:t xml:space="preserve">Minnett, P., Alvera-Azcarate, A., &amp; Chin, T. (2019). Half a century of satellite remote sensing of </w:t>
-      </w:r>
-      <w:proofErr w:type="spellStart"/>
-      <w:r>
-        <w:t>seasurface</w:t>
-      </w:r>
-      <w:proofErr w:type="spellEnd"/>
-      <w:r>
-        <w:t xml:space="preserve"> temperature. </w:t>
+        <w:t xml:space="preserve">Minnett, P., Alvera-Azcarate, A., &amp; Chin, T. (2019). Half a century of satellite remote sensing of seasurface temperature. </w:t>
       </w:r>
       <w:r>
         <w:rPr>
@@ -2782,21 +2509,8 @@
       <w:pPr>
         <w:ind w:left="2" w:right="188"/>
       </w:pPr>
-      <w:proofErr w:type="spellStart"/>
-      <w:r>
-        <w:t>Mnih</w:t>
-      </w:r>
-      <w:proofErr w:type="spellEnd"/>
-      <w:r>
-        <w:t xml:space="preserve">, V., &amp; </w:t>
-      </w:r>
-      <w:proofErr w:type="spellStart"/>
-      <w:r>
-        <w:t>Kavukcuoglu</w:t>
-      </w:r>
-      <w:proofErr w:type="spellEnd"/>
-      <w:r>
-        <w:t xml:space="preserve">, K. (2015). Human-level control through deep reinforcement learning. </w:t>
+      <w:r>
+        <w:t xml:space="preserve">Mnih, V., &amp; Kavukcuoglu, K. (2015). Human-level control through deep reinforcement learning. </w:t>
       </w:r>
       <w:r>
         <w:rPr>
@@ -2882,14 +2596,12 @@
       <w:r>
         <w:t xml:space="preserve">Schulman, J., Wolski, F., &amp; Dhariwal, P. (2017). Proximal Policy Optimization Algorithms. </w:t>
       </w:r>
-      <w:proofErr w:type="spellStart"/>
       <w:r>
         <w:rPr>
           <w:i/>
         </w:rPr>
         <w:t>ArXiv</w:t>
       </w:r>
-      <w:proofErr w:type="spellEnd"/>
       <w:r>
         <w:t xml:space="preserve">. </w:t>
       </w:r>
@@ -2899,15 +2611,7 @@
         <w:ind w:left="2" w:right="188"/>
       </w:pPr>
       <w:r>
-        <w:t xml:space="preserve">Shams, S., </w:t>
-      </w:r>
-      <w:proofErr w:type="spellStart"/>
-      <w:r>
-        <w:t>Boehnert</w:t>
-      </w:r>
-      <w:proofErr w:type="spellEnd"/>
-      <w:r>
-        <w:t>, J., &amp; Wilhelmi, O. (2025). Assessing the Impact of Conservation Practices on Post-</w:t>
+        <w:t>Shams, S., Boehnert, J., &amp; Wilhelmi, O. (2025). Assessing the Impact of Conservation Practices on Post-</w:t>
       </w:r>
     </w:p>
     <w:p>
@@ -4688,15 +4392,27 @@
 </a:theme>
 </file>
 
-<file path=customXml/item1.xml><?xml version="1.0" encoding="utf-8"?>
-<p:properties xmlns:p="http://schemas.microsoft.com/office/2006/metadata/properties" xmlns:xsi="http://www.w3.org/2001/XMLSchema-instance" xmlns:pc="http://schemas.microsoft.com/office/infopath/2007/PartnerControls">
-  <documentManagement>
-    <_activity xmlns="e9179cbc-72aa-4872-8f5d-94cb765b2445" xsi:nil="true"/>
-  </documentManagement>
-</p:properties>
+<file path=word/webextensions/taskpanes.xml><?xml version="1.0" encoding="utf-8"?>
+<wetp:taskpanes xmlns:wetp="http://schemas.microsoft.com/office/webextensions/taskpanes/2010/11">
+  <wetp:taskpane dockstate="right" visibility="0" width="350" row="1">
+    <wetp:webextensionref xmlns:r="http://schemas.openxmlformats.org/officeDocument/2006/relationships" r:id="rId1"/>
+  </wetp:taskpane>
+</wetp:taskpanes>
 </file>
 
-<file path=customXml/item2.xml><?xml version="1.0" encoding="utf-8"?>
+<file path=word/webextensions/webextension1.xml><?xml version="1.0" encoding="utf-8"?>
+<we:webextension xmlns:we="http://schemas.microsoft.com/office/webextensions/webextension/2010/11" id="{35A6291C-BB6A-4E37-8D9B-9BB00DD46A45}">
+  <we:reference id="wa200010453" version="1.0.0.1" store="en-US" storeType="OMEX"/>
+  <we:alternateReferences>
+    <we:reference id="WA200010453" version="1.0.0.1" store="WA200010453" storeType="OMEX"/>
+  </we:alternateReferences>
+  <we:properties/>
+  <we:bindings/>
+  <we:snapshot xmlns:r="http://schemas.openxmlformats.org/officeDocument/2006/relationships"/>
+</we:webextension>
+</file>
+
+<file path=customXml/item1.xml><?xml version="1.0" encoding="utf-8"?>
 <ct:contentTypeSchema xmlns:ct="http://schemas.microsoft.com/office/2006/metadata/contentType" xmlns:ma="http://schemas.microsoft.com/office/2006/metadata/properties/metaAttributes" ct:_="" ma:_="" ma:contentTypeName="Document" ma:contentTypeID="0x010100A20944401B910B49B41B485B97C36C5F" ma:contentTypeVersion="13" ma:contentTypeDescription="Create a new document." ma:contentTypeScope="" ma:versionID="d5fda0271dd1a2554fc72d08a8822dea">
   <xsd:schema xmlns:xsd="http://www.w3.org/2001/XMLSchema" xmlns:xs="http://www.w3.org/2001/XMLSchema" xmlns:p="http://schemas.microsoft.com/office/2006/metadata/properties" xmlns:ns3="e6c0d1a3-4b4c-4608-9c73-6f9067be7b89" xmlns:ns4="e9179cbc-72aa-4872-8f5d-94cb765b2445" targetNamespace="http://schemas.microsoft.com/office/2006/metadata/properties" ma:root="true" ma:fieldsID="8cf8334556949c3715dd01fde4358063" ns3:_="" ns4:_="">
     <xsd:import namespace="e6c0d1a3-4b4c-4608-9c73-6f9067be7b89"/>
@@ -4917,7 +4633,19 @@
 </ct:contentTypeSchema>
 </file>
 
+<file path=customXml/item2.xml><?xml version="1.0" encoding="utf-8"?>
+<b:Sources xmlns:b="http://schemas.openxmlformats.org/officeDocument/2006/bibliography" xmlns="http://schemas.openxmlformats.org/officeDocument/2006/bibliography" SelectedStyle="\APASixthEditionOfficeOnline.xsl" StyleName="APA" Version="6"/>
+</file>
+
 <file path=customXml/item3.xml><?xml version="1.0" encoding="utf-8"?>
+<p:properties xmlns:p="http://schemas.microsoft.com/office/2006/metadata/properties" xmlns:xsi="http://www.w3.org/2001/XMLSchema-instance" xmlns:pc="http://schemas.microsoft.com/office/infopath/2007/PartnerControls">
+  <documentManagement>
+    <_activity xmlns="e9179cbc-72aa-4872-8f5d-94cb765b2445" xsi:nil="true"/>
+  </documentManagement>
+</p:properties>
+</file>
+
+<file path=customXml/item4.xml><?xml version="1.0" encoding="utf-8"?>
 <?mso-contentType ?>
 <FormTemplates xmlns="http://schemas.microsoft.com/sharepoint/v3/contenttype/forms">
   <Display>DocumentLibraryForm</Display>
@@ -4926,21 +4654,7 @@
 </FormTemplates>
 </file>
 
-<file path=customXml/item4.xml><?xml version="1.0" encoding="utf-8"?>
-<b:Sources xmlns:b="http://schemas.openxmlformats.org/officeDocument/2006/bibliography" xmlns="http://schemas.openxmlformats.org/officeDocument/2006/bibliography" SelectedStyle="\APASixthEditionOfficeOnline.xsl" StyleName="APA" Version="6"/>
-</file>
-
 <file path=customXml/itemProps1.xml><?xml version="1.0" encoding="utf-8"?>
-<ds:datastoreItem xmlns:ds="http://schemas.openxmlformats.org/officeDocument/2006/customXml" ds:itemID="{8E76CBBD-B995-47E4-816F-AD879F8BC433}">
-  <ds:schemaRefs>
-    <ds:schemaRef ds:uri="http://schemas.microsoft.com/office/2006/metadata/properties"/>
-    <ds:schemaRef ds:uri="http://schemas.microsoft.com/office/infopath/2007/PartnerControls"/>
-    <ds:schemaRef ds:uri="e9179cbc-72aa-4872-8f5d-94cb765b2445"/>
-  </ds:schemaRefs>
-</ds:datastoreItem>
-</file>
-
-<file path=customXml/itemProps2.xml><?xml version="1.0" encoding="utf-8"?>
 <ds:datastoreItem xmlns:ds="http://schemas.openxmlformats.org/officeDocument/2006/customXml" ds:itemID="{4C29220A-F68E-4E3A-ADDF-63B0E97AD1AD}">
   <ds:schemaRefs>
     <ds:schemaRef ds:uri="http://schemas.microsoft.com/office/2006/metadata/contentType"/>
@@ -4959,18 +4673,28 @@
 </ds:datastoreItem>
 </file>
 
+<file path=customXml/itemProps2.xml><?xml version="1.0" encoding="utf-8"?>
+<ds:datastoreItem xmlns:ds="http://schemas.openxmlformats.org/officeDocument/2006/customXml" ds:itemID="{5807E444-3703-472B-BC36-D2064BEA8F82}">
+  <ds:schemaRefs>
+    <ds:schemaRef ds:uri="http://schemas.openxmlformats.org/officeDocument/2006/bibliography"/>
+  </ds:schemaRefs>
+</ds:datastoreItem>
+</file>
+
 <file path=customXml/itemProps3.xml><?xml version="1.0" encoding="utf-8"?>
+<ds:datastoreItem xmlns:ds="http://schemas.openxmlformats.org/officeDocument/2006/customXml" ds:itemID="{8E76CBBD-B995-47E4-816F-AD879F8BC433}">
+  <ds:schemaRefs>
+    <ds:schemaRef ds:uri="http://schemas.microsoft.com/office/2006/metadata/properties"/>
+    <ds:schemaRef ds:uri="http://schemas.microsoft.com/office/infopath/2007/PartnerControls"/>
+    <ds:schemaRef ds:uri="e9179cbc-72aa-4872-8f5d-94cb765b2445"/>
+  </ds:schemaRefs>
+</ds:datastoreItem>
+</file>
+
+<file path=customXml/itemProps4.xml><?xml version="1.0" encoding="utf-8"?>
 <ds:datastoreItem xmlns:ds="http://schemas.openxmlformats.org/officeDocument/2006/customXml" ds:itemID="{9D89C6C9-2E68-46BD-8304-CB1D7D4E035C}">
   <ds:schemaRefs>
     <ds:schemaRef ds:uri="http://schemas.microsoft.com/sharepoint/v3/contenttype/forms"/>
   </ds:schemaRefs>
 </ds:datastoreItem>
-</file>
-
-<file path=customXml/itemProps4.xml><?xml version="1.0" encoding="utf-8"?>
-<ds:datastoreItem xmlns:ds="http://schemas.openxmlformats.org/officeDocument/2006/customXml" ds:itemID="{5807E444-3703-472B-BC36-D2064BEA8F82}">
-  <ds:schemaRefs>
-    <ds:schemaRef ds:uri="http://schemas.openxmlformats.org/officeDocument/2006/bibliography"/>
-  </ds:schemaRefs>
-</ds:datastoreItem>
 </file>
</xml_diff>